<commit_message>
chore(content): normalize British 'grey' spellings to 'gray' in art bible; refresh press kit exports
</commit_message>
<xml_diff>
--- a/public/press-kit/fates-edge-first-play-kit.docx
+++ b/public/press-kit/fates-edge-first-play-kit.docx
@@ -3375,7 +3375,7 @@
         <w:rPr>
           <w:rFonts w:ascii="Aptos" w:hAnsi="Aptos"/>
         </w:rPr>
-        <w:t>If Escape fills first, the final crossing begins with Dominant Position. Otherwise it begins Controlled. If Court's Net fills, it begins Desperate and the Silken Blade appears.</w:t>
+        <w:t>If Escape fills first, the crossing begins Dominant; otherwise Controlled. A full Court’s Net takes priority: Desperate, and the Silken Blade appears. Lock this state before the crossing roll. Resolve it before spending its new SB; those affect subsequent fallout, never its declared Position or DV.</w:t>
       </w:r>
     </w:p>
     <w:p>
@@ -3417,7 +3417,7 @@
         <w:rPr>
           <w:rFonts w:ascii="Aptos" w:hAnsi="Aptos"/>
         </w:rPr>
-        <w:t>Ask what each character takes and which route they create. Use one or two rolls, then move. Do not require every task.</w:t>
+        <w:t>Ask what each character takes and which route they create. Use one or two rolls, including any Setup rolls, then move. Do not require every task.</w:t>
       </w:r>
     </w:p>
     <w:tbl>
@@ -3901,7 +3901,7 @@
         <w:rPr>
           <w:rFonts w:ascii="Aptos" w:hAnsi="Aptos"/>
         </w:rPr>
-        <w:t>Offer all three routes. Let the players combine them or invent another. Resolve two substantial actions at most before the final crossing.</w:t>
+        <w:t>Offer all three routes. Let players combine them or invent another. Resolve at most two substantial actions, including Setup, before the crossing. Assists modify an action; they do not add another roll.</w:t>
       </w:r>
     </w:p>
     <w:tbl>
@@ -5046,7 +5046,7 @@
         <w:rPr>
           <w:rFonts w:ascii="Aptos" w:hAnsi="Aptos"/>
         </w:rPr>
-        <w:t>Frame danger through a player's response whenever possible. "A Knife drives you toward the canal. What do you do?" Use NPC pools for an opposed action when needed. Spend Story Beats for named special moves. NPCs use Resilience instead of the player Harm track and do not hold Boons. Their listed Fatigue value sets their Fatigue track.</w:t>
+        <w:t>Only the player rolls against NPC opposition. Set DV 3 for a Knife, or DV 4 for the Blade’s hard resistance; adjust for the actual task. Describe the threat, set Position and consequences, then resolve the player’s response. New independent ordinary attacks cost 1 SB; named moves cost their listed SB and require their trigger. A declared failed-defense consequence is not a second attack. See Adversary Resolution at the end of this kit for damage and examples.</w:t>
       </w:r>
     </w:p>
     <w:p>
@@ -5496,7 +5496,7 @@
         <w:rPr>
           <w:rFonts w:ascii="Aptos" w:hAnsi="Aptos"/>
         </w:rPr>
-        <w:t>Court's Net full: Desperate, DV 4. The Silken Blade acts and success will still carry a visible price.</w:t>
+        <w:t>Court’s Net full: Desperate, DV 4. The Silken Blade threatens the crossing. Announce the price of failure and any unavoidable cost before rolling.</w:t>
       </w:r>
     </w:p>
     <w:p>
@@ -9163,7 +9163,7 @@
         <w:rPr>
           <w:rFonts w:ascii="Aptos" w:hAnsi="Aptos"/>
         </w:rPr>
-        <w:t>Padded coat, Light armor.</w:t>
+        <w:t>Padded coat, Light armor. With Body 1, even 1 Fatigue fills your track: clear it and raise Harm by 1. Armor-converted Fatigue and Fatigue-for-Boon substitution both do this.</w:t>
       </w:r>
     </w:p>
     <w:p>
@@ -10775,6 +10775,193 @@
           <w:rFonts w:ascii="Aptos" w:hAnsi="Aptos"/>
         </w:rPr>
         <w:t>First Play Kit. September 2026.</w:t>
+      </w:r>
+    </w:p>
+    <w:p>
+      <w:r>
+        <w:br w:type="page"/>
+      </w:r>
+    </w:p>
+    <w:p>
+      <w:pPr>
+        <w:pStyle w:val="Title"/>
+      </w:pPr>
+      <w:r>
+        <w:t>Adversary Resolution</w:t>
+      </w:r>
+    </w:p>
+    <w:p>
+      <w:r>
+        <w:t>Use this procedure whenever the Knives or the Silken Blade oppose a character. The existing player outcome matrix, Armor table, and Boon limits still apply.</w:t>
+      </w:r>
+    </w:p>
+    <w:p>
+      <w:pPr>
+        <w:pStyle w:val="Heading2"/>
+      </w:pPr>
+      <w:r>
+        <w:t>Adversary damage and Fatigue</w:t>
+      </w:r>
+    </w:p>
+    <w:p>
+      <w:r>
+        <w:t>Adversaries track their listed Fatigue and Resilience, but never player Boons or a player Harm-level track. Harm printed on an adversary is damage it deals. Its Fatigue track uses the listed capacity (or the listed governing Attribute).</w:t>
+      </w:r>
+    </w:p>
+    <w:p>
+      <w:pPr>
+        <w:pStyle w:val="Heading2"/>
+      </w:pPr>
+      <w:r>
+        <w:t>Resolve a damaging hit</w:t>
+      </w:r>
+    </w:p>
+    <w:p>
+      <w:r>
+        <w:t>Before rolling, state the attack’s Harm, Position, DV, Effect, and consequences. On a successful damaging hit, start with weapon or ability Harm and apply explicit Harm bonuses. Effect describes what the action accomplishes; it does not secretly multiply Harm. Any change to damage from Effect must be stated before the roll. A Partial grants the stated lesser progress, not automatically full weapon damage.</w:t>
+      </w:r>
+    </w:p>
+    <w:p>
+      <w:pPr>
+        <w:pStyle w:val="Heading2"/>
+      </w:pPr>
+      <w:r>
+        <w:t>Armor, then Resilience</w:t>
+      </w:r>
+    </w:p>
+    <w:p>
+      <w:r>
+        <w:t>If Armor applies, use the Armor Conversion Table. None or ignored Armor leaves all incoming Harm unconverted and creates no armor Fatigue. Ignoring 1 point of Armor means one category lower for that hit: Heavy becomes Medium, Medium becomes Light, and Light becomes None. An ability that ignores Armor entirely uses None. For incoming Harm above 3, convert the first 3 using that column and leave the excess as Harm. Subtract remaining Harm from Resilience, clearing existing Fatigue if any Harm remains. Then add the converted Fatigue. Do not also subtract one Resilience merely because the attack hit.</w:t>
+      </w:r>
+    </w:p>
+    <w:p>
+      <w:pPr>
+        <w:pStyle w:val="Heading2"/>
+      </w:pPr>
+      <w:r>
+        <w:t>NPC Fatigue overflow</w:t>
+      </w:r>
+    </w:p>
+    <w:p>
+      <w:r>
+        <w:t>When Fatigue reaches or exceeds its capacity, subtract 1 Resilience, clear Fatigue, and discard excess Fatigue. Check once per resolved hit or separate Fatigue event; do not loop over discarded excess. Fatigue never increases the adversary’s outgoing Harm. In a player-facing test, each marked NPC Fatigue improves the opposing player’s Position by one step, capped at Dominant; excess improvement adds no dice and does not lower DV. Apply the player’s own penalties as usual.</w:t>
+      </w:r>
+    </w:p>
+    <w:p>
+      <w:pPr>
+        <w:pStyle w:val="Heading2"/>
+      </w:pPr>
+      <w:r>
+        <w:t>Ending the opposition</w:t>
+      </w:r>
+    </w:p>
+    <w:p>
+      <w:r>
+        <w:t>At zero Resilience the adversary is defeated in the manner established by the fiction. For a phased adversary, end that phase and start the next with its listed Resilience and cleared Fatigue; excess damage does not cross phases unless its rules say so. A puzzle adversary with no Resilience still requires its stated Resolution. Bargains, escape, surrender, and decisive fictional solutions can end opposition without attrition.</w:t>
+      </w:r>
+    </w:p>
+    <w:p>
+      <w:pPr>
+        <w:pStyle w:val="Heading2"/>
+      </w:pPr>
+      <w:r>
+        <w:t>Worked hits</w:t>
+      </w:r>
+    </w:p>
+    <w:p>
+      <w:r>
+        <w:t>The Silken Blade has Resilience 8, Fatigue capacity 3, and Light Armor. A successful Harm 2 hit becomes 1 Harm and 1 Fatigue: Resilience 7, Fatigue 1. A later unconverted wound clears that old Fatigue before adding its new armor Fatigue. Three separate Harm 1 hits against her Light Armor each add 1 Fatigue; the third fills the track, clears it, and removes 1 Resilience. Against her Light Armor, a Harm 3 Backstab ignores its one category and removes 3 Resilience and clears existing Fatigue.</w:t>
+      </w:r>
+    </w:p>
+    <w:p>
+      <w:pPr>
+        <w:pStyle w:val="Heading2"/>
+      </w:pPr>
+      <w:r>
+        <w:t>Player-facing opposition</w:t>
+      </w:r>
+    </w:p>
+    <w:p>
+      <w:r>
+        <w:t>Adversaries have no separate initiative turn. Describe their intent and ask how the player responds. Before the player rolls, set DV by the actual opposition (normally 3, or 4 for hard resistance), set Position, and name the consequence. A printed NPC pool is a competence reference, not a second roll or a formula converting dice into DV. For NPC opposition, references to an opposed test mean this player-facing test.</w:t>
+      </w:r>
+    </w:p>
+    <w:p>
+      <w:pPr>
+        <w:pStyle w:val="Heading2"/>
+      </w:pPr>
+      <w:r>
+        <w:t>Resolve the response</w:t>
+      </w:r>
+    </w:p>
+    <w:p>
+      <w:r>
+        <w:t>Use the usual player outcome matrix: meeting DV achieves the declared intent; a Partial makes the declared lesser progress; a Miss makes none. Apply any stated consequence through that outcome and the relevant SB procedure. A successful defense avoids the threatened hit; it does not deal retaliatory weapon Harm unless that was the declared action. A Partial defense uses the lesser protection agreed before the roll. Never charge damage twice for one consequence.</w:t>
+      </w:r>
+    </w:p>
+    <w:p>
+      <w:pPr>
+        <w:pStyle w:val="Heading2"/>
+      </w:pPr>
+      <w:r>
+        <w:t>When the GM spends SB</w:t>
+      </w:r>
+    </w:p>
+    <w:p>
+      <w:r>
+        <w:t>A threat, warning, or demand is free to describe. Harm from a previously announced failed response is the consequence of that response, not a free extra NPC attack. To introduce a new attack or special complication independently, spend SB: use the creature’s listed move, or 1 SB for an ordinary attack that prompts a player-facing response. Pay a named move’s printed cost and respect its trigger; Poisoned Cut’s 1 SB buys the poison after a hit, not a second attack. An expressly free opportunity attack remains free and prompts the same response procedure. A paid move does not bypass a defense or automatically inflict Harm unless it expressly says so.</w:t>
+      </w:r>
+    </w:p>
+    <w:p>
+      <w:pPr>
+        <w:pStyle w:val="Heading2"/>
+      </w:pPr>
+      <w:r>
+        <w:t>Lock stakes before rolling</w:t>
+      </w:r>
+    </w:p>
+    <w:p>
+      <w:r>
+        <w:t>Position, DV, Effect, and the announced consequence are fixed when the roll is framed. Resolve that roll before spending its newly generated SB. Those SB can change the next action or subsequent fallout, not retroactively change the roll’s Position, DV, success, or damage. Earlier SB may shape a new test only before its stakes are locked.</w:t>
+      </w:r>
+    </w:p>
+    <w:p>
+      <w:pPr>
+        <w:pStyle w:val="Heading2"/>
+      </w:pPr>
+      <w:r>
+        <w:t>Setup and the short scenario</w:t>
+      </w:r>
+    </w:p>
+    <w:p>
+      <w:r>
+        <w:t>A successful Setup gives the next action +1 Position or a step up in Effect, not +1 die. Use the strongest applicable Setup benefit for one action; repeated Setups do not stack numeric benefits. A Setup roll counts toward the scene’s action allowance. Assist is separate: spend 1 Boon for +1 die and share the risk, within the pool cap. Do not roll safe repetition to farm resources.</w:t>
+      </w:r>
+    </w:p>
+    <w:p>
+      <w:pPr>
+        <w:pStyle w:val="Heading2"/>
+      </w:pPr>
+      <w:r>
+        <w:t>A defense against a Knife</w:t>
+      </w:r>
+    </w:p>
+    <w:p>
+      <w:r>
+        <w:t>The GM spends 1 SB on a fresh Knife attack and describes a slash toward Lyra. Lyra tries to slip behind a dye vat. Agree Controlled, DV 3; success reaches cover without the hit, a Partial reaches cover but takes Harm 1, and a Miss leaves her exposed with the Knife’s Harm 1. Lyra alone rolls. Her Armor resolves any incoming Harm normally. The GM banks her 1s but spends them only after this response resolves. The SB that bought the attack cannot also pay a named follow-up move.</w:t>
+      </w:r>
+    </w:p>
+    <w:p>
+      <w:pPr>
+        <w:pStyle w:val="Heading2"/>
+      </w:pPr>
+      <w:r>
+        <w:t>Optional combat practice</w:t>
+      </w:r>
+    </w:p>
+    <w:p>
+      <w:r>
+        <w:t>For a group that wants to try combat, offer a brief confrontation with a Knife before the crossing and count it as one city-route action. Explain that evasion, disarming, surrender, and exposure can work too. Keep the original short route for groups that avoid a fight; the Blade is pressure, not a mandatory boss. Do not add free enemy attacks to force a demonstration.</w:t>
       </w:r>
     </w:p>
     <w:sectPr>

</xml_diff>